<commit_message>
Fix 5 pleading templates, add test harness, fix attorney detail page
- PFR: Replace hardcoded arrest_date, case_number, dob, police_department,
  arrest_county with {{placeholders}} (deeply fragmented XML runs)
- Entry Generic: Replace hardcoded city, citation, attorney names, dates
- Waiver of Preliminary Hearing: Fix split-run bar number (#6+3222)
- OOP Entry & Motion to Withdraw: Fix split-run # before {{attorney_bar}}
- Add tests/test_pleadings.py: 209 checks across all 11 pleading templates
  (config, prompts, placeholders, fill, format validation)
- Fix attorney detail 500 error: restructure get_attorney_detail() return
  to match template expectations (productivity, aging, call_list dicts)
- Update PFR DOCUMENT_TYPES: add arrest_date, arrest_county, police_department

Co-Authored-By: Claude Opus 4.6 <noreply@anthropic.com>
</commit_message>
<xml_diff>
--- a/data/templates/Entry_Generic.docx
+++ b/data/templates/Entry_Generic.docx
@@ -57,7 +57,7 @@
           <w:sz w:val="26"/>
           <w:szCs w:val="26"/>
         </w:rPr>
-        <w:t>LAKE SAINT LOUIS</w:t>
+        <w:t>{{CITY}}</w:t>
       </w:r>
     </w:p>
     <w:p>
@@ -247,7 +247,7 @@
           <w:szCs w:val="26"/>
           <w:highlight w:val="yellow"/>
         </w:rPr>
-        <w:t>170754464, 170754465</w:t>
+        <w:t>{{case_number}}</w:t>
       </w:r>
     </w:p>
     <w:p>
@@ -442,7 +442,7 @@
           <w:sz w:val="26"/>
           <w:szCs w:val="26"/>
         </w:rPr>
-        <w:t xml:space="preserve"> John C. </w:t>
+        <w:t xml:space="preserve"> </w:t>
       </w:r>
       <w:proofErr w:type="spellStart"/>
       <w:r>
@@ -918,7 +918,7 @@
           <w:szCs w:val="26"/>
           <w:u w:val="single"/>
         </w:rPr>
-        <w:t xml:space="preserve">/s/John </w:t>
+        <w:t xml:space="preserve">/s/</w:t>
       </w:r>
       <w:proofErr w:type="spellStart"/>
       <w:r>
@@ -971,7 +971,7 @@
           <w:sz w:val="26"/>
           <w:szCs w:val="26"/>
         </w:rPr>
-        <w:t xml:space="preserve">John C. </w:t>
+        <w:t xml:space="preserve"/>
       </w:r>
       <w:proofErr w:type="spellStart"/>
       <w:r>
@@ -1029,7 +1029,7 @@
           <w:sz w:val="26"/>
           <w:szCs w:val="26"/>
         </w:rPr>
-        <w:t xml:space="preserve">D. Christopher </w:t>
+        <w:t xml:space="preserve"/>
       </w:r>
       <w:proofErr w:type="spellStart"/>
       <w:r>
@@ -1037,7 +1037,7 @@
           <w:sz w:val="26"/>
           <w:szCs w:val="26"/>
         </w:rPr>
-        <w:t>LaPee</w:t>
+        <w:t/>
       </w:r>
       <w:proofErr w:type="spellEnd"/>
       <w:r>
@@ -1046,7 +1046,7 @@
           <w:szCs w:val="26"/>
         </w:rPr>
         <w:tab/>
-        <w:t>#63013</w:t>
+        <w:t/>
       </w:r>
     </w:p>
     <w:p>
@@ -1080,7 +1080,7 @@
           <w:sz w:val="26"/>
           <w:szCs w:val="26"/>
         </w:rPr>
-        <w:t>75 West Lockwood Avenue, Suite 250</w:t>
+        <w:t>{{firm_address}}</w:t>
       </w:r>
     </w:p>
     <w:p>
@@ -1163,7 +1163,7 @@
           <w:sz w:val="26"/>
           <w:szCs w:val="26"/>
         </w:rPr>
-        <w:t>314) 561-9690</w:t>
+        <w:t>{{firm_phone}}</w:t>
       </w:r>
     </w:p>
     <w:p>
@@ -1216,7 +1216,7 @@
           <w:sz w:val="26"/>
           <w:szCs w:val="26"/>
         </w:rPr>
-        <w:t>clapee@jcsattorney.com</w:t>
+        <w:t/>
       </w:r>
     </w:p>
     <w:p>
@@ -1350,7 +1350,7 @@
           <w:sz w:val="26"/>
           <w:szCs w:val="26"/>
         </w:rPr>
-        <w:t xml:space="preserve">Lake Saint Louis Prosecuting Attorney, Anthony </w:t>
+        <w:t xml:space="preserve">{{city}} Prosecuting Attorney, Anthony </w:t>
       </w:r>
       <w:proofErr w:type="spellStart"/>
       <w:r>
@@ -1358,7 +1358,7 @@
           <w:sz w:val="26"/>
           <w:szCs w:val="26"/>
         </w:rPr>
-        <w:t>Linson</w:t>
+        <w:t/>
       </w:r>
       <w:proofErr w:type="spellEnd"/>
       <w:r>
@@ -1465,7 +1465,7 @@
           <w:sz w:val="26"/>
           <w:szCs w:val="26"/>
         </w:rPr>
-        <w:t xml:space="preserve">Anthony </w:t>
+        <w:t xml:space="preserve">{{prosecutor_name}}</w:t>
       </w:r>
       <w:proofErr w:type="spellStart"/>
       <w:r>
@@ -1473,7 +1473,7 @@
           <w:sz w:val="26"/>
           <w:szCs w:val="26"/>
         </w:rPr>
-        <w:t>Linson</w:t>
+        <w:t/>
       </w:r>
       <w:proofErr w:type="spellEnd"/>
     </w:p>
@@ -1490,39 +1490,39 @@
           <w:sz w:val="26"/>
           <w:szCs w:val="26"/>
         </w:rPr>
-        <w:t>Lake Saint Louis Prosecuting Attorney’s Office</w:t>
-      </w:r>
-    </w:p>
-    <w:p>
-      <w:pPr>
-        <w:jc w:val="both"/>
-        <w:rPr>
-          <w:sz w:val="26"/>
-          <w:szCs w:val="26"/>
-        </w:rPr>
-      </w:pPr>
-      <w:r>
-        <w:rPr>
-          <w:sz w:val="26"/>
-          <w:szCs w:val="26"/>
-        </w:rPr>
-        <w:t>200 Civic Center Drive</w:t>
-      </w:r>
-    </w:p>
-    <w:p>
-      <w:pPr>
-        <w:jc w:val="both"/>
-        <w:rPr>
-          <w:sz w:val="26"/>
-          <w:szCs w:val="26"/>
-        </w:rPr>
-      </w:pPr>
-      <w:r>
-        <w:rPr>
-          <w:sz w:val="26"/>
-          <w:szCs w:val="26"/>
-        </w:rPr>
-        <w:t>Lake Saint Louis, Missouri 63367</w:t>
+        <w:t>{{city}} Prosecuting Attorney’s Office</w:t>
+      </w:r>
+    </w:p>
+    <w:p>
+      <w:pPr>
+        <w:jc w:val="both"/>
+        <w:rPr>
+          <w:sz w:val="26"/>
+          <w:szCs w:val="26"/>
+        </w:rPr>
+      </w:pPr>
+      <w:r>
+        <w:rPr>
+          <w:sz w:val="26"/>
+          <w:szCs w:val="26"/>
+        </w:rPr>
+        <w:t>{{prosecutor_address}}</w:t>
+      </w:r>
+    </w:p>
+    <w:p>
+      <w:pPr>
+        <w:jc w:val="both"/>
+        <w:rPr>
+          <w:sz w:val="26"/>
+          <w:szCs w:val="26"/>
+        </w:rPr>
+      </w:pPr>
+      <w:r>
+        <w:rPr>
+          <w:sz w:val="26"/>
+          <w:szCs w:val="26"/>
+        </w:rPr>
+        <w:t>{{prosecutor_city_state_zip}}</w:t>
       </w:r>
     </w:p>
     <w:bookmarkEnd w:id="0"/>

</xml_diff>